<commit_message>
Fix job dates: Trifler through 12 Sep 2025, Emmvee from 15 Sep 2025.
Co-authored-by: Sumit Kaktwan <Sumit211995@users.noreply.github.com>
</commit_message>
<xml_diff>
--- a/resume/Sumit_Kaktwan_Frontend_Resume.docx
+++ b/resume/Sumit_Kaktwan_Frontend_Resume.docx
@@ -230,7 +230,7 @@
           <w:sz w:val="20"/>
         </w:rPr>
         <w:tab/>
-        <w:t>Sep 2025 – Present</w:t>
+        <w:t>15 Sep 2025 – Present</w:t>
       </w:r>
     </w:p>
     <w:p>
@@ -380,7 +380,7 @@
           <w:sz w:val="20"/>
         </w:rPr>
         <w:tab/>
-        <w:t>Oct 2023 – Aug 2025</w:t>
+        <w:t>Oct 2023 – 12 Sep 2025</w:t>
       </w:r>
     </w:p>
     <w:p>

</xml_diff>

<commit_message>
Fit Word resume on one page and tighten ATS-friendly wording.
Match DOCX to the one-page PDF, use standard headings and ASCII hyphens,
fix grammar, and keep exact Trifler/Emmvee dates.

Co-authored-by: Sumit Kaktwan <Sumit211995@users.noreply.github.com>
</commit_message>
<xml_diff>
--- a/resume/Sumit_Kaktwan_Frontend_Resume.docx
+++ b/resume/Sumit_Kaktwan_Frontend_Resume.docx
@@ -4,7 +4,8 @@
   <w:body>
     <w:p>
       <w:pPr>
-        <w:spacing w:before="0" w:after="0" w:line="259" w:lineRule="auto"/>
+        <w:widowControl/>
+        <w:spacing w:before="0" w:after="0" w:line="240" w:lineRule="auto"/>
         <w:jc w:val="center"/>
       </w:pPr>
       <w:r>
@@ -12,32 +13,47 @@
           <w:rFonts w:ascii="Calibri" w:hAnsi="Calibri" w:eastAsia="Calibri"/>
           <w:b/>
           <w:color w:val="1F4E79"/>
-          <w:sz w:val="36"/>
+          <w:sz w:val="32"/>
         </w:rPr>
         <w:t>SUMIT KAKTWAN</w:t>
       </w:r>
     </w:p>
     <w:p>
       <w:pPr>
-        <w:spacing w:before="40" w:after="40" w:line="259" w:lineRule="auto"/>
+        <w:widowControl/>
+        <w:spacing w:before="20" w:after="0" w:line="240" w:lineRule="auto"/>
         <w:jc w:val="center"/>
       </w:pPr>
       <w:r>
         <w:rPr>
           <w:rFonts w:ascii="Calibri" w:hAnsi="Calibri" w:eastAsia="Calibri"/>
           <w:b w:val="0"/>
-          <w:sz w:val="20"/>
+          <w:sz w:val="19"/>
         </w:rPr>
-        <w:t>Bengaluru, India  |  +91 99977 76729  |  Sumitcskaktwan@gmail.com</w:t>
-        <w:br/>
-        <w:t>linkedin.com/in/sumit-kaktwan-270633157  |  github.com/Sumit211995</w:t>
+        <w:t>Bengaluru, Karnataka, India  |  +91-9997776729  |  sumitcskaktwan@gmail.com</w:t>
       </w:r>
     </w:p>
     <w:p>
       <w:pPr>
-        <w:spacing w:before="160" w:after="60" w:line="259" w:lineRule="auto"/>
+        <w:widowControl/>
+        <w:spacing w:before="0" w:after="20" w:line="240" w:lineRule="auto"/>
+        <w:jc w:val="center"/>
+      </w:pPr>
+      <w:r>
+        <w:rPr>
+          <w:rFonts w:ascii="Calibri" w:hAnsi="Calibri" w:eastAsia="Calibri"/>
+          <w:b w:val="0"/>
+          <w:sz w:val="18"/>
+        </w:rPr>
+        <w:t>https://www.linkedin.com/in/sumit-kaktwan-270633157  |  https://github.com/Sumit211995</w:t>
+      </w:r>
+    </w:p>
+    <w:p>
+      <w:pPr>
+        <w:widowControl/>
+        <w:spacing w:before="80" w:after="20" w:line="240" w:lineRule="auto"/>
         <w:pBdr>
-          <w:bottom w:val="single" w:sz="12" w:space="1" w:color="1F4E79"/>
+          <w:bottom w:val="single" w:sz="8" w:space="1" w:color="1F4E79"/>
         </w:pBdr>
       </w:pPr>
       <w:r>
@@ -45,29 +61,31 @@
           <w:rFonts w:ascii="Calibri" w:hAnsi="Calibri" w:eastAsia="Calibri"/>
           <w:b/>
           <w:color w:val="1F4E79"/>
-          <w:sz w:val="22"/>
+          <w:sz w:val="21"/>
         </w:rPr>
         <w:t>PROFESSIONAL SUMMARY</w:t>
       </w:r>
     </w:p>
     <w:p>
       <w:pPr>
-        <w:spacing w:before="40" w:after="40" w:line="259" w:lineRule="auto"/>
+        <w:widowControl/>
+        <w:spacing w:before="20" w:after="20" w:line="240" w:lineRule="auto"/>
       </w:pPr>
       <w:r>
         <w:rPr>
           <w:rFonts w:ascii="Calibri" w:hAnsi="Calibri" w:eastAsia="Calibri"/>
           <w:b w:val="0"/>
-          <w:sz w:val="21"/>
+          <w:sz w:val="19"/>
         </w:rPr>
-        <w:t>Frontend Engineer with 3 years of experience shipping production React.js and Next.js products—multi-role admin dashboards, warranty/claim workflows, and CMS-backed websites. Strong in TypeScript, RBAC, REST API integration, and deployments on Railway and Linux VMs. Independently owned end-to-end UI for solar manufacturing, travel, and enterprise meeting tools; mentored small frontend teams on selected projects. Targeting mid-level Frontend / Next.js roles in product-led companies.</w:t>
+        <w:t>Frontend Engineer with 3 years of experience building production React.js and Next.js applications, including role-based admin dashboards, warranty and claim workflows, and CMS-backed websites. Skilled in TypeScript, RBAC, REST API integration, Redux, Zustand, and deployments on Railway and Linux VMs. Owned end-to-end frontend for solar manufacturing, travel, and enterprise meeting products, and guided 2-3 frontend developers on selected projects.</w:t>
       </w:r>
     </w:p>
     <w:p>
       <w:pPr>
-        <w:spacing w:before="160" w:after="60" w:line="259" w:lineRule="auto"/>
+        <w:widowControl/>
+        <w:spacing w:before="80" w:after="20" w:line="240" w:lineRule="auto"/>
         <w:pBdr>
-          <w:bottom w:val="single" w:sz="12" w:space="1" w:color="1F4E79"/>
+          <w:bottom w:val="single" w:sz="8" w:space="1" w:color="1F4E79"/>
         </w:pBdr>
       </w:pPr>
       <w:r>
@@ -75,20 +93,21 @@
           <w:rFonts w:ascii="Calibri" w:hAnsi="Calibri" w:eastAsia="Calibri"/>
           <w:b/>
           <w:color w:val="1F4E79"/>
-          <w:sz w:val="22"/>
+          <w:sz w:val="21"/>
         </w:rPr>
         <w:t>TECHNICAL SKILLS</w:t>
       </w:r>
     </w:p>
     <w:p>
       <w:pPr>
-        <w:spacing w:before="20" w:after="20" w:line="259" w:lineRule="auto"/>
+        <w:widowControl/>
+        <w:spacing w:before="0" w:after="20" w:line="240" w:lineRule="auto"/>
       </w:pPr>
       <w:r>
         <w:rPr>
           <w:rFonts w:ascii="Calibri" w:hAnsi="Calibri" w:eastAsia="Calibri"/>
           <w:b/>
-          <w:sz w:val="21"/>
+          <w:sz w:val="19"/>
         </w:rPr>
         <w:t xml:space="preserve">Languages: </w:t>
       </w:r>
@@ -96,20 +115,21 @@
         <w:rPr>
           <w:rFonts w:ascii="Calibri" w:hAnsi="Calibri" w:eastAsia="Calibri"/>
           <w:b w:val="0"/>
-          <w:sz w:val="21"/>
+          <w:sz w:val="19"/>
         </w:rPr>
         <w:t>JavaScript (ES6+), TypeScript, HTML5, CSS3, SCSS</w:t>
       </w:r>
     </w:p>
     <w:p>
       <w:pPr>
-        <w:spacing w:before="20" w:after="20" w:line="259" w:lineRule="auto"/>
+        <w:widowControl/>
+        <w:spacing w:before="0" w:after="20" w:line="240" w:lineRule="auto"/>
       </w:pPr>
       <w:r>
         <w:rPr>
           <w:rFonts w:ascii="Calibri" w:hAnsi="Calibri" w:eastAsia="Calibri"/>
           <w:b/>
-          <w:sz w:val="21"/>
+          <w:sz w:val="19"/>
         </w:rPr>
         <w:t xml:space="preserve">Frontend: </w:t>
       </w:r>
@@ -117,58 +137,61 @@
         <w:rPr>
           <w:rFonts w:ascii="Calibri" w:hAnsi="Calibri" w:eastAsia="Calibri"/>
           <w:b w:val="0"/>
-          <w:sz w:val="21"/>
+          <w:sz w:val="19"/>
         </w:rPr>
-        <w:t>React.js, Next.js, Redux, Zustand, React Hook Form, Zod, Tailwind CSS</w:t>
+        <w:t>React.js, Next.js, Redux, Zustand, React Hook Form, Zod, Tailwind CSS, Responsive Web Design</w:t>
       </w:r>
     </w:p>
     <w:p>
       <w:pPr>
-        <w:spacing w:before="20" w:after="20" w:line="259" w:lineRule="auto"/>
+        <w:widowControl/>
+        <w:spacing w:before="0" w:after="20" w:line="240" w:lineRule="auto"/>
       </w:pPr>
       <w:r>
         <w:rPr>
           <w:rFonts w:ascii="Calibri" w:hAnsi="Calibri" w:eastAsia="Calibri"/>
           <w:b/>
-          <w:sz w:val="21"/>
+          <w:sz w:val="19"/>
         </w:rPr>
-        <w:t xml:space="preserve">Data &amp; integration: </w:t>
+        <w:t xml:space="preserve">Integration: </w:t>
       </w:r>
       <w:r>
         <w:rPr>
           <w:rFonts w:ascii="Calibri" w:hAnsi="Calibri" w:eastAsia="Calibri"/>
           <w:b w:val="0"/>
-          <w:sz w:val="21"/>
+          <w:sz w:val="19"/>
         </w:rPr>
-        <w:t>REST APIs, Payload CMS, PostgreSQL, Azure Functions, Microsoft Graph API (via backend)</w:t>
+        <w:t>REST APIs, Payload CMS, PostgreSQL, Azure Functions, Microsoft Graph API, Firebase, Google Maps API</w:t>
       </w:r>
     </w:p>
     <w:p>
       <w:pPr>
-        <w:spacing w:before="20" w:after="20" w:line="259" w:lineRule="auto"/>
+        <w:widowControl/>
+        <w:spacing w:before="0" w:after="20" w:line="240" w:lineRule="auto"/>
       </w:pPr>
       <w:r>
         <w:rPr>
           <w:rFonts w:ascii="Calibri" w:hAnsi="Calibri" w:eastAsia="Calibri"/>
           <w:b/>
-          <w:sz w:val="21"/>
+          <w:sz w:val="19"/>
         </w:rPr>
-        <w:t xml:space="preserve">Tooling &amp; deploy: </w:t>
+        <w:t xml:space="preserve">Tools: </w:t>
       </w:r>
       <w:r>
         <w:rPr>
           <w:rFonts w:ascii="Calibri" w:hAnsi="Calibri" w:eastAsia="Calibri"/>
           <w:b w:val="0"/>
-          <w:sz w:val="21"/>
+          <w:sz w:val="19"/>
         </w:rPr>
-        <w:t>Git, GitHub, Firebase, Railway, Linux VM, Agile / code review</w:t>
+        <w:t>Git, GitHub, Railway, Linux VM, Agile, Code Review, UI/UX implementation</w:t>
       </w:r>
     </w:p>
     <w:p>
       <w:pPr>
-        <w:spacing w:before="160" w:after="60" w:line="259" w:lineRule="auto"/>
+        <w:widowControl/>
+        <w:spacing w:before="80" w:after="20" w:line="240" w:lineRule="auto"/>
         <w:pBdr>
-          <w:bottom w:val="single" w:sz="12" w:space="1" w:color="1F4E79"/>
+          <w:bottom w:val="single" w:sz="8" w:space="1" w:color="1F4E79"/>
         </w:pBdr>
       </w:pPr>
       <w:r>
@@ -176,23 +199,24 @@
           <w:rFonts w:ascii="Calibri" w:hAnsi="Calibri" w:eastAsia="Calibri"/>
           <w:b/>
           <w:color w:val="1F4E79"/>
-          <w:sz w:val="22"/>
+          <w:sz w:val="21"/>
         </w:rPr>
-        <w:t>EXPERIENCE</w:t>
+        <w:t>PROFESSIONAL EXPERIENCE</w:t>
       </w:r>
     </w:p>
     <w:p>
       <w:pPr>
+        <w:widowControl/>
         <w:tabs>
-          <w:tab w:pos="10512" w:val="right"/>
+          <w:tab w:pos="11088" w:val="right"/>
         </w:tabs>
-        <w:spacing w:before="120" w:after="0" w:line="259" w:lineRule="auto"/>
+        <w:spacing w:before="80" w:after="0" w:line="240" w:lineRule="auto"/>
       </w:pPr>
       <w:r>
         <w:rPr>
           <w:rFonts w:ascii="Calibri" w:hAnsi="Calibri" w:eastAsia="Calibri"/>
           <w:b/>
-          <w:sz w:val="21"/>
+          <w:sz w:val="20"/>
         </w:rPr>
         <w:t>Emmvee Technology Pvt. Ltd. (Emmvee Photovoltaic)</w:t>
       </w:r>
@@ -200,7 +224,7 @@
         <w:rPr>
           <w:rFonts w:ascii="Calibri" w:hAnsi="Calibri" w:eastAsia="Calibri"/>
           <w:b w:val="0"/>
-          <w:sz w:val="20"/>
+          <w:sz w:val="19"/>
         </w:rPr>
         <w:tab/>
         <w:t>Bengaluru, India</w:t>
@@ -208,17 +232,18 @@
     </w:p>
     <w:p>
       <w:pPr>
+        <w:widowControl/>
         <w:tabs>
-          <w:tab w:pos="10512" w:val="right"/>
+          <w:tab w:pos="11088" w:val="right"/>
         </w:tabs>
-        <w:spacing w:before="0" w:after="40" w:line="259" w:lineRule="auto"/>
+        <w:spacing w:before="0" w:after="20" w:line="240" w:lineRule="auto"/>
       </w:pPr>
       <w:r>
         <w:rPr>
           <w:rFonts w:ascii="Calibri" w:hAnsi="Calibri" w:eastAsia="Calibri"/>
           <w:b w:val="0"/>
-          <w:color w:val="374151"/>
-          <w:sz w:val="20"/>
+          <w:color w:val="464646"/>
+          <w:sz w:val="19"/>
         </w:rPr>
         <w:t>Frontend Engineer</w:t>
       </w:r>
@@ -226,123 +251,116 @@
         <w:rPr>
           <w:rFonts w:ascii="Calibri" w:hAnsi="Calibri" w:eastAsia="Calibri"/>
           <w:b w:val="0"/>
-          <w:color w:val="374151"/>
-          <w:sz w:val="20"/>
+          <w:color w:val="464646"/>
+          <w:sz w:val="19"/>
         </w:rPr>
         <w:tab/>
-        <w:t>15 Sep 2025 – Present</w:t>
+        <w:t>15 Sep 2025 - Present</w:t>
       </w:r>
     </w:p>
     <w:p>
       <w:pPr>
-        <w:spacing w:before="20" w:after="20" w:line="259" w:lineRule="auto"/>
-        <w:ind w:left="259" w:hanging="216"/>
+        <w:widowControl/>
+        <w:spacing w:before="0" w:after="20" w:line="240" w:lineRule="auto"/>
+        <w:ind w:left="230" w:hanging="187"/>
       </w:pPr>
       <w:r>
         <w:rPr>
           <w:rFonts w:ascii="Calibri" w:hAnsi="Calibri" w:eastAsia="Calibri"/>
           <w:b w:val="0"/>
-          <w:sz w:val="20"/>
+          <w:sz w:val="18"/>
         </w:rPr>
-        <w:t>•  Owned frontend delivery for five production applications (React.js / Next.js / TypeScript): solar shop-floor (Prism), warranty &amp; claims, Board Meeting &amp; Committee (BMC), Roamiyo travel admin, and the Emmvee Foundation website.</w:t>
+        <w:t>- Owned frontend for five production apps in React.js, Next.js, and TypeScript: Prism (solar shop floor), warranty and claims, Board Meeting and Committee (BMC), Roamiyo travel admin, and the Emmvee Foundation website.</w:t>
       </w:r>
     </w:p>
     <w:p>
       <w:pPr>
-        <w:spacing w:before="20" w:after="20" w:line="259" w:lineRule="auto"/>
-        <w:ind w:left="259" w:hanging="216"/>
+        <w:widowControl/>
+        <w:spacing w:before="0" w:after="20" w:line="240" w:lineRule="auto"/>
+        <w:ind w:left="230" w:hanging="187"/>
       </w:pPr>
       <w:r>
         <w:rPr>
           <w:rFonts w:ascii="Calibri" w:hAnsi="Calibri" w:eastAsia="Calibri"/>
           <w:b w:val="0"/>
-          <w:sz w:val="20"/>
+          <w:sz w:val="18"/>
         </w:rPr>
-        <w:t>•  Prism (solar production): role-based login and dashboards for QA, Production, PPC, Admin, Super Admin, and Manager—line and module reports tailored to each role.</w:t>
+        <w:t>- Built Prism dashboards with RBAC for QA, Production, PPC, Admin, Super Admin, and Manager, including line and module reports.</w:t>
       </w:r>
     </w:p>
     <w:p>
       <w:pPr>
-        <w:spacing w:before="20" w:after="20" w:line="259" w:lineRule="auto"/>
-        <w:ind w:left="259" w:hanging="216"/>
+        <w:widowControl/>
+        <w:spacing w:before="0" w:after="20" w:line="240" w:lineRule="auto"/>
+        <w:ind w:left="230" w:hanging="187"/>
       </w:pPr>
       <w:r>
         <w:rPr>
           <w:rFonts w:ascii="Calibri" w:hAnsi="Calibri" w:eastAsia="Calibri"/>
           <w:b w:val="0"/>
-          <w:sz w:val="20"/>
+          <w:sz w:val="18"/>
         </w:rPr>
-        <w:t>•  Warranty portal (React, Zustand auth): 15+ roles (homeowner, distributor, CSR, QA, Finance, Sales, and more). Invoice/PSN transfer, claim intake, QA assignment, refund/replacement/rework tickets, multi-level approvals, and certificate download after login.</w:t>
+        <w:t>- Developed the React.js warranty portal with Zustand authentication for 15+ roles. Covered invoice and PSN transfer, claim intake, QA assignment, refund, replacement, and rework tickets, multi-level approvals, and certificate download.</w:t>
       </w:r>
     </w:p>
     <w:p>
       <w:pPr>
-        <w:spacing w:before="20" w:after="20" w:line="259" w:lineRule="auto"/>
-        <w:ind w:left="259" w:hanging="216"/>
+        <w:widowControl/>
+        <w:spacing w:before="0" w:after="20" w:line="240" w:lineRule="auto"/>
+        <w:ind w:left="230" w:hanging="187"/>
       </w:pPr>
       <w:r>
         <w:rPr>
           <w:rFonts w:ascii="Calibri" w:hAnsi="Calibri" w:eastAsia="Calibri"/>
           <w:b w:val="0"/>
-          <w:sz w:val="20"/>
+          <w:sz w:val="18"/>
         </w:rPr>
-        <w:t>•  BMC (Next.js, Tailwind, SCSS): full UI for Teams-connected meetings—create/approve/cancel/reject, agendas, attendance, action items, AI-generated minutes, documents, and user management. Backend consumed Microsoft Graph API.</w:t>
+        <w:t>- Implemented BMC in Next.js, Tailwind CSS, and SCSS for Microsoft Teams-connected meetings: create, approve, cancel, reject, agendas, attendance, action items, AI-generated minutes of meeting (MOM), documents, and user management. Backend used Microsoft Graph API.</w:t>
       </w:r>
     </w:p>
     <w:p>
       <w:pPr>
-        <w:spacing w:before="20" w:after="20" w:line="259" w:lineRule="auto"/>
-        <w:ind w:left="259" w:hanging="216"/>
+        <w:widowControl/>
+        <w:spacing w:before="0" w:after="20" w:line="240" w:lineRule="auto"/>
+        <w:ind w:left="230" w:hanging="187"/>
       </w:pPr>
       <w:r>
         <w:rPr>
           <w:rFonts w:ascii="Calibri" w:hAnsi="Calibri" w:eastAsia="Calibri"/>
           <w:b w:val="0"/>
-          <w:sz w:val="20"/>
+          <w:sz w:val="18"/>
         </w:rPr>
-        <w:t>•  Roamiyo admin (Next.js): customers, flights, stays, transactions, support tickets, itineraries, and dashboard charts. Contributed to the RoamWithRoamiyo web app (Redux, Azure Functions, Next.js) in production.</w:t>
+        <w:t>- Built the Roamiyo admin dashboard in Next.js (customers, flights, stays, transactions, tickets, itineraries, charts) and contributed to the production RoamWithRoamiyo web app using Redux, Azure Functions, and Next.js.</w:t>
       </w:r>
     </w:p>
     <w:p>
       <w:pPr>
-        <w:spacing w:before="20" w:after="20" w:line="259" w:lineRule="auto"/>
-        <w:ind w:left="259" w:hanging="216"/>
+        <w:widowControl/>
+        <w:spacing w:before="0" w:after="20" w:line="240" w:lineRule="auto"/>
+        <w:ind w:left="230" w:hanging="187"/>
       </w:pPr>
       <w:r>
         <w:rPr>
           <w:rFonts w:ascii="Calibri" w:hAnsi="Calibri" w:eastAsia="Calibri"/>
           <w:b w:val="0"/>
-          <w:sz w:val="20"/>
+          <w:sz w:val="18"/>
         </w:rPr>
-        <w:t>•  Emmvee Foundation: Next.js + Payload CMS + PostgreSQL, including customized Payload admin CSS. Deployed Foundation and BMC on Railway; Prism and Warranty on Linux VM.</w:t>
+        <w:t>- Delivered the Foundation website with Next.js, Payload CMS, and PostgreSQL. Deployed Foundation and BMC on Railway; deployed Prism and Warranty on a Linux VM. Sole frontend owner on most products; guided 2-3 frontend developers on selected work.</w:t>
       </w:r>
     </w:p>
     <w:p>
       <w:pPr>
-        <w:spacing w:before="20" w:after="20" w:line="259" w:lineRule="auto"/>
-        <w:ind w:left="259" w:hanging="216"/>
-      </w:pPr>
-      <w:r>
-        <w:rPr>
-          <w:rFonts w:ascii="Calibri" w:hAnsi="Calibri" w:eastAsia="Calibri"/>
-          <w:b w:val="0"/>
-          <w:sz w:val="20"/>
-        </w:rPr>
-        <w:t>•  Delivered most UIs as sole frontend owner; guided 2–3 frontend developers on selected projects.</w:t>
-      </w:r>
-    </w:p>
-    <w:p>
-      <w:pPr>
+        <w:widowControl/>
         <w:tabs>
-          <w:tab w:pos="10512" w:val="right"/>
+          <w:tab w:pos="11088" w:val="right"/>
         </w:tabs>
-        <w:spacing w:before="120" w:after="0" w:line="259" w:lineRule="auto"/>
+        <w:spacing w:before="80" w:after="0" w:line="240" w:lineRule="auto"/>
       </w:pPr>
       <w:r>
         <w:rPr>
           <w:rFonts w:ascii="Calibri" w:hAnsi="Calibri" w:eastAsia="Calibri"/>
           <w:b/>
-          <w:sz w:val="21"/>
+          <w:sz w:val="20"/>
         </w:rPr>
         <w:t>Trifler India (Aquonics Tech Service Pvt. Ltd.)</w:t>
       </w:r>
@@ -350,7 +368,7 @@
         <w:rPr>
           <w:rFonts w:ascii="Calibri" w:hAnsi="Calibri" w:eastAsia="Calibri"/>
           <w:b w:val="0"/>
-          <w:sz w:val="20"/>
+          <w:sz w:val="19"/>
         </w:rPr>
         <w:tab/>
         <w:t>Bengaluru, India</w:t>
@@ -358,17 +376,18 @@
     </w:p>
     <w:p>
       <w:pPr>
+        <w:widowControl/>
         <w:tabs>
-          <w:tab w:pos="10512" w:val="right"/>
+          <w:tab w:pos="11088" w:val="right"/>
         </w:tabs>
-        <w:spacing w:before="0" w:after="40" w:line="259" w:lineRule="auto"/>
+        <w:spacing w:before="0" w:after="20" w:line="240" w:lineRule="auto"/>
       </w:pPr>
       <w:r>
         <w:rPr>
           <w:rFonts w:ascii="Calibri" w:hAnsi="Calibri" w:eastAsia="Calibri"/>
           <w:b w:val="0"/>
-          <w:color w:val="374151"/>
-          <w:sz w:val="20"/>
+          <w:color w:val="464646"/>
+          <w:sz w:val="19"/>
         </w:rPr>
         <w:t>Frontend Developer</w:t>
       </w:r>
@@ -376,192 +395,133 @@
         <w:rPr>
           <w:rFonts w:ascii="Calibri" w:hAnsi="Calibri" w:eastAsia="Calibri"/>
           <w:b w:val="0"/>
-          <w:color w:val="374151"/>
-          <w:sz w:val="20"/>
+          <w:color w:val="464646"/>
+          <w:sz w:val="19"/>
         </w:rPr>
         <w:tab/>
-        <w:t>Oct 2023 – 12 Sep 2025</w:t>
+        <w:t>Oct 2023 - 12 Sep 2025</w:t>
       </w:r>
     </w:p>
     <w:p>
       <w:pPr>
-        <w:spacing w:before="20" w:after="20" w:line="259" w:lineRule="auto"/>
-        <w:ind w:left="259" w:hanging="216"/>
+        <w:widowControl/>
+        <w:spacing w:before="0" w:after="20" w:line="240" w:lineRule="auto"/>
+        <w:ind w:left="230" w:hanging="187"/>
       </w:pPr>
       <w:r>
         <w:rPr>
           <w:rFonts w:ascii="Calibri" w:hAnsi="Calibri" w:eastAsia="Calibri"/>
           <w:b w:val="0"/>
-          <w:sz w:val="20"/>
+          <w:sz w:val="18"/>
         </w:rPr>
-        <w:t>•  Built a multi-step partner onboarding dashboard with React Hook Form, Zod validation, token-based auth, Google Maps location, and Firebase event logging.</w:t>
+        <w:t>- Built a multi-step partner onboarding dashboard with React Hook Form, Zod validation, token-based authentication, Google Maps API, and Firebase event logging.</w:t>
       </w:r>
     </w:p>
     <w:p>
       <w:pPr>
-        <w:spacing w:before="20" w:after="20" w:line="259" w:lineRule="auto"/>
-        <w:ind w:left="259" w:hanging="216"/>
+        <w:widowControl/>
+        <w:spacing w:before="0" w:after="20" w:line="240" w:lineRule="auto"/>
+        <w:ind w:left="230" w:hanging="187"/>
       </w:pPr>
       <w:r>
         <w:rPr>
           <w:rFonts w:ascii="Calibri" w:hAnsi="Calibri" w:eastAsia="Calibri"/>
           <w:b w:val="0"/>
-          <w:sz w:val="20"/>
+          <w:sz w:val="18"/>
         </w:rPr>
-        <w:t>•  Developed a Next.js and TypeScript admin dashboard for user/partner management and a blog CMS.</w:t>
+        <w:t>- Developed a Next.js and TypeScript admin dashboard for user and partner management and a blog CMS.</w:t>
       </w:r>
     </w:p>
     <w:p>
       <w:pPr>
-        <w:spacing w:before="20" w:after="20" w:line="259" w:lineRule="auto"/>
-        <w:ind w:left="259" w:hanging="216"/>
+        <w:widowControl/>
+        <w:spacing w:before="0" w:after="20" w:line="240" w:lineRule="auto"/>
+        <w:ind w:left="230" w:hanging="187"/>
       </w:pPr>
       <w:r>
         <w:rPr>
           <w:rFonts w:ascii="Calibri" w:hAnsi="Calibri" w:eastAsia="Calibri"/>
           <w:b w:val="0"/>
-          <w:sz w:val="20"/>
+          <w:sz w:val="18"/>
         </w:rPr>
-        <w:t>•  Partnered with design and backend on features, code reviews, debugging, and maintainable UI.</w:t>
+        <w:t>- Collaborated with design and backend teams on product features, code reviews, debugging, and maintainable UI.</w:t>
       </w:r>
     </w:p>
     <w:p>
       <w:pPr>
+        <w:widowControl/>
         <w:tabs>
-          <w:tab w:pos="10512" w:val="right"/>
+          <w:tab w:pos="11088" w:val="right"/>
         </w:tabs>
-        <w:spacing w:before="120" w:after="0" w:line="259" w:lineRule="auto"/>
+        <w:spacing w:before="80" w:after="0" w:line="240" w:lineRule="auto"/>
       </w:pPr>
       <w:r>
         <w:rPr>
           <w:rFonts w:ascii="Calibri" w:hAnsi="Calibri" w:eastAsia="Calibri"/>
           <w:b/>
-          <w:sz w:val="21"/>
+          <w:sz w:val="20"/>
         </w:rPr>
-        <w:t>Satyam Auto Component</w:t>
+        <w:t>Satyam Auto Component  |  Tata Motors</w:t>
       </w:r>
       <w:r>
         <w:rPr>
           <w:rFonts w:ascii="Calibri" w:hAnsi="Calibri" w:eastAsia="Calibri"/>
           <w:b w:val="0"/>
-          <w:sz w:val="20"/>
+          <w:sz w:val="19"/>
         </w:rPr>
         <w:tab/>
-        <w:t>Gurugram, India</w:t>
+        <w:t>Gurugram / Pantnagar, India</w:t>
       </w:r>
     </w:p>
     <w:p>
       <w:pPr>
+        <w:widowControl/>
         <w:tabs>
-          <w:tab w:pos="10512" w:val="right"/>
+          <w:tab w:pos="11088" w:val="right"/>
         </w:tabs>
-        <w:spacing w:before="0" w:after="40" w:line="259" w:lineRule="auto"/>
+        <w:spacing w:before="0" w:after="20" w:line="240" w:lineRule="auto"/>
       </w:pPr>
       <w:r>
         <w:rPr>
           <w:rFonts w:ascii="Calibri" w:hAnsi="Calibri" w:eastAsia="Calibri"/>
           <w:b w:val="0"/>
-          <w:color w:val="374151"/>
-          <w:sz w:val="20"/>
+          <w:color w:val="464646"/>
+          <w:sz w:val="19"/>
         </w:rPr>
-        <w:t>Engineer — industrial engineering / operations</w:t>
+        <w:t>Engineer  |  Junior Associate, Lean Manufacturing</w:t>
       </w:r>
       <w:r>
         <w:rPr>
           <w:rFonts w:ascii="Calibri" w:hAnsi="Calibri" w:eastAsia="Calibri"/>
           <w:b w:val="0"/>
-          <w:color w:val="374151"/>
-          <w:sz w:val="20"/>
+          <w:color w:val="464646"/>
+          <w:sz w:val="19"/>
         </w:rPr>
         <w:tab/>
-        <w:t>May 2019 – Jul 2020</w:t>
+        <w:t>May 2019 - Jul 2020  |  Aug 2014 - Apr 2019</w:t>
       </w:r>
     </w:p>
     <w:p>
       <w:pPr>
-        <w:spacing w:before="20" w:after="20" w:line="259" w:lineRule="auto"/>
-        <w:ind w:left="259" w:hanging="216"/>
+        <w:widowControl/>
+        <w:spacing w:before="0" w:after="20" w:line="240" w:lineRule="auto"/>
+        <w:ind w:left="230" w:hanging="187"/>
       </w:pPr>
       <w:r>
         <w:rPr>
           <w:rFonts w:ascii="Calibri" w:hAnsi="Calibri" w:eastAsia="Calibri"/>
           <w:b w:val="0"/>
-          <w:sz w:val="20"/>
+          <w:sz w:val="18"/>
         </w:rPr>
-        <w:t>•  Productivity studies (MOST), line balancing, kaizen, and ergonomics—domain background now used on solar production (Prism) UIs.</w:t>
+        <w:t>- MOST, line balancing, kaizen, ergonomics, and cost reduction in automotive manufacturing. This domain background supports solar production UIs such as Prism.</w:t>
       </w:r>
     </w:p>
     <w:p>
       <w:pPr>
-        <w:tabs>
-          <w:tab w:pos="10512" w:val="right"/>
-        </w:tabs>
-        <w:spacing w:before="120" w:after="0" w:line="259" w:lineRule="auto"/>
-      </w:pPr>
-      <w:r>
-        <w:rPr>
-          <w:rFonts w:ascii="Calibri" w:hAnsi="Calibri" w:eastAsia="Calibri"/>
-          <w:b/>
-          <w:sz w:val="21"/>
-        </w:rPr>
-        <w:t>Tata Motors</w:t>
-      </w:r>
-      <w:r>
-        <w:rPr>
-          <w:rFonts w:ascii="Calibri" w:hAnsi="Calibri" w:eastAsia="Calibri"/>
-          <w:b w:val="0"/>
-          <w:sz w:val="20"/>
-        </w:rPr>
-        <w:tab/>
-        <w:t>Pantnagar, India</w:t>
-      </w:r>
-    </w:p>
-    <w:p>
-      <w:pPr>
-        <w:tabs>
-          <w:tab w:pos="10512" w:val="right"/>
-        </w:tabs>
-        <w:spacing w:before="0" w:after="40" w:line="259" w:lineRule="auto"/>
-      </w:pPr>
-      <w:r>
-        <w:rPr>
-          <w:rFonts w:ascii="Calibri" w:hAnsi="Calibri" w:eastAsia="Calibri"/>
-          <w:b w:val="0"/>
-          <w:color w:val="374151"/>
-          <w:sz w:val="20"/>
-        </w:rPr>
-        <w:t>Junior Associate — lean manufacturing</w:t>
-      </w:r>
-      <w:r>
-        <w:rPr>
-          <w:rFonts w:ascii="Calibri" w:hAnsi="Calibri" w:eastAsia="Calibri"/>
-          <w:b w:val="0"/>
-          <w:color w:val="374151"/>
-          <w:sz w:val="20"/>
-        </w:rPr>
-        <w:tab/>
-        <w:t>Aug 2014 – Apr 2019</w:t>
-      </w:r>
-    </w:p>
-    <w:p>
-      <w:pPr>
-        <w:spacing w:before="20" w:after="20" w:line="259" w:lineRule="auto"/>
-        <w:ind w:left="259" w:hanging="216"/>
-      </w:pPr>
-      <w:r>
-        <w:rPr>
-          <w:rFonts w:ascii="Calibri" w:hAnsi="Calibri" w:eastAsia="Calibri"/>
-          <w:b w:val="0"/>
-          <w:sz w:val="20"/>
-        </w:rPr>
-        <w:t>•  Work measurement, kaizen, ergonomics, and cost reduction on the shop floor.</w:t>
-      </w:r>
-    </w:p>
-    <w:p>
-      <w:pPr>
-        <w:spacing w:before="160" w:after="60" w:line="259" w:lineRule="auto"/>
+        <w:widowControl/>
+        <w:spacing w:before="80" w:after="20" w:line="240" w:lineRule="auto"/>
         <w:pBdr>
-          <w:bottom w:val="single" w:sz="12" w:space="1" w:color="1F4E79"/>
+          <w:bottom w:val="single" w:sz="8" w:space="1" w:color="1F4E79"/>
         </w:pBdr>
       </w:pPr>
       <w:r>
@@ -569,23 +529,24 @@
           <w:rFonts w:ascii="Calibri" w:hAnsi="Calibri" w:eastAsia="Calibri"/>
           <w:b/>
           <w:color w:val="1F4E79"/>
-          <w:sz w:val="22"/>
+          <w:sz w:val="21"/>
         </w:rPr>
         <w:t>EDUCATION</w:t>
       </w:r>
     </w:p>
     <w:p>
       <w:pPr>
+        <w:widowControl/>
         <w:tabs>
-          <w:tab w:pos="10512" w:val="right"/>
+          <w:tab w:pos="11088" w:val="right"/>
         </w:tabs>
-        <w:spacing w:before="120" w:after="0" w:line="259" w:lineRule="auto"/>
+        <w:spacing w:before="80" w:after="0" w:line="240" w:lineRule="auto"/>
       </w:pPr>
       <w:r>
         <w:rPr>
           <w:rFonts w:ascii="Calibri" w:hAnsi="Calibri" w:eastAsia="Calibri"/>
           <w:b/>
-          <w:sz w:val="21"/>
+          <w:sz w:val="20"/>
         </w:rPr>
         <w:t>DIT University, Dehradun</w:t>
       </w:r>
@@ -593,7 +554,7 @@
         <w:rPr>
           <w:rFonts w:ascii="Calibri" w:hAnsi="Calibri" w:eastAsia="Calibri"/>
           <w:b w:val="0"/>
-          <w:sz w:val="20"/>
+          <w:sz w:val="19"/>
         </w:rPr>
         <w:tab/>
         <w:t>Uttarakhand, India</w:t>
@@ -601,36 +562,38 @@
     </w:p>
     <w:p>
       <w:pPr>
+        <w:widowControl/>
         <w:tabs>
-          <w:tab w:pos="10512" w:val="right"/>
+          <w:tab w:pos="11088" w:val="right"/>
         </w:tabs>
-        <w:spacing w:before="0" w:after="40" w:line="259" w:lineRule="auto"/>
+        <w:spacing w:before="0" w:after="20" w:line="240" w:lineRule="auto"/>
       </w:pPr>
       <w:r>
         <w:rPr>
           <w:rFonts w:ascii="Calibri" w:hAnsi="Calibri" w:eastAsia="Calibri"/>
           <w:b w:val="0"/>
-          <w:color w:val="374151"/>
-          <w:sz w:val="20"/>
+          <w:color w:val="464646"/>
+          <w:sz w:val="19"/>
         </w:rPr>
-        <w:t>B.Tech, Computer Science &amp; Engineering  |  CGPA 7.7/10</w:t>
+        <w:t>Bachelor of Technology in Computer Science and Engineering  |  CGPA 7.7/10</w:t>
       </w:r>
       <w:r>
         <w:rPr>
           <w:rFonts w:ascii="Calibri" w:hAnsi="Calibri" w:eastAsia="Calibri"/>
           <w:b w:val="0"/>
-          <w:color w:val="374151"/>
-          <w:sz w:val="20"/>
+          <w:color w:val="464646"/>
+          <w:sz w:val="19"/>
         </w:rPr>
         <w:tab/>
-        <w:t>Aug 2020 – Jun 2023</w:t>
+        <w:t>Aug 2020 - Jun 2023</w:t>
       </w:r>
     </w:p>
     <w:p>
       <w:pPr>
-        <w:spacing w:before="160" w:after="60" w:line="259" w:lineRule="auto"/>
+        <w:widowControl/>
+        <w:spacing w:before="80" w:after="20" w:line="240" w:lineRule="auto"/>
         <w:pBdr>
-          <w:bottom w:val="single" w:sz="12" w:space="1" w:color="1F4E79"/>
+          <w:bottom w:val="single" w:sz="8" w:space="1" w:color="1F4E79"/>
         </w:pBdr>
       </w:pPr>
       <w:r>
@@ -638,27 +601,28 @@
           <w:rFonts w:ascii="Calibri" w:hAnsi="Calibri" w:eastAsia="Calibri"/>
           <w:b/>
           <w:color w:val="1F4E79"/>
-          <w:sz w:val="22"/>
+          <w:sz w:val="21"/>
         </w:rPr>
         <w:t>CERTIFICATIONS</w:t>
       </w:r>
     </w:p>
     <w:p>
       <w:pPr>
-        <w:spacing w:before="40" w:after="40" w:line="259" w:lineRule="auto"/>
+        <w:widowControl/>
+        <w:spacing w:before="20" w:after="0" w:line="240" w:lineRule="auto"/>
       </w:pPr>
       <w:r>
         <w:rPr>
           <w:rFonts w:ascii="Calibri" w:hAnsi="Calibri" w:eastAsia="Calibri"/>
           <w:b w:val="0"/>
-          <w:sz w:val="21"/>
+          <w:sz w:val="19"/>
         </w:rPr>
-        <w:t>JavaScript and React.js — NamasteDev  ·  Web Development — Udemy  ·  Core Java — Smart Programming</w:t>
+        <w:t>JavaScript and React.js, NamasteDev; Web Development, Udemy; Core Java, Smart Programming</w:t>
       </w:r>
     </w:p>
     <w:sectPr>
       <w:pgSz w:w="12240" w:h="15840"/>
-      <w:pgMar w:top="648" w:right="864" w:bottom="576" w:left="864" w:header="720" w:footer="720" w:gutter="0"/>
+      <w:pgMar w:top="547" w:right="691" w:bottom="461" w:left="691" w:header="720" w:footer="720" w:gutter="0"/>
       <w:cols w:space="720"/>
       <w:docGrid w:linePitch="360"/>
     </w:sectPr>
@@ -1029,6 +993,13 @@
     <w:name w:val="Normal"/>
     <w:qFormat/>
     <w:rsid w:val="00FC693F"/>
+    <w:pPr>
+      <w:spacing w:after="0" w:before="0" w:line="240" w:lineRule="auto"/>
+    </w:pPr>
+    <w:rPr>
+      <w:rFonts w:ascii="Calibri" w:hAnsi="Calibri"/>
+      <w:sz w:val="19"/>
+    </w:rPr>
   </w:style>
   <w:style w:type="paragraph" w:styleId="Header">
     <w:name w:val="header"/>

</xml_diff>

<commit_message>
Balance one-page A4 resume so Word and PDF fill the page.
Use A4, restore readable spacing, and keep certifications on page one
in both Word and PDF.

Co-authored-by: Sumit Kaktwan <Sumit211995@users.noreply.github.com>
</commit_message>
<xml_diff>
--- a/resume/Sumit_Kaktwan_Frontend_Resume.docx
+++ b/resume/Sumit_Kaktwan_Frontend_Resume.docx
@@ -28,7 +28,7 @@
         <w:rPr>
           <w:rFonts w:ascii="Calibri" w:hAnsi="Calibri" w:eastAsia="Calibri"/>
           <w:b w:val="0"/>
-          <w:sz w:val="19"/>
+          <w:sz w:val="20"/>
         </w:rPr>
         <w:t>Bengaluru, Karnataka, India  |  +91-9997776729  |  sumitcskaktwan@gmail.com</w:t>
       </w:r>
@@ -43,7 +43,7 @@
         <w:rPr>
           <w:rFonts w:ascii="Calibri" w:hAnsi="Calibri" w:eastAsia="Calibri"/>
           <w:b w:val="0"/>
-          <w:sz w:val="18"/>
+          <w:sz w:val="20"/>
         </w:rPr>
         <w:t>https://www.linkedin.com/in/sumit-kaktwan-270633157  |  https://github.com/Sumit211995</w:t>
       </w:r>
@@ -51,7 +51,7 @@
     <w:p>
       <w:pPr>
         <w:widowControl/>
-        <w:spacing w:before="80" w:after="20" w:line="240" w:lineRule="auto"/>
+        <w:spacing w:before="80" w:after="40" w:line="240" w:lineRule="auto"/>
         <w:pBdr>
           <w:bottom w:val="single" w:sz="8" w:space="1" w:color="1F4E79"/>
         </w:pBdr>
@@ -75,7 +75,7 @@
         <w:rPr>
           <w:rFonts w:ascii="Calibri" w:hAnsi="Calibri" w:eastAsia="Calibri"/>
           <w:b w:val="0"/>
-          <w:sz w:val="19"/>
+          <w:sz w:val="20"/>
         </w:rPr>
         <w:t>Frontend Engineer with 3 years of experience building production React.js and Next.js applications, including role-based admin dashboards, warranty and claim workflows, and CMS-backed websites. Skilled in TypeScript, RBAC, REST API integration, Redux, Zustand, and deployments on Railway and Linux VMs. Owned end-to-end frontend for solar manufacturing, travel, and enterprise meeting products, and guided 2-3 frontend developers on selected projects.</w:t>
       </w:r>
@@ -83,7 +83,7 @@
     <w:p>
       <w:pPr>
         <w:widowControl/>
-        <w:spacing w:before="80" w:after="20" w:line="240" w:lineRule="auto"/>
+        <w:spacing w:before="80" w:after="40" w:line="240" w:lineRule="auto"/>
         <w:pBdr>
           <w:bottom w:val="single" w:sz="8" w:space="1" w:color="1F4E79"/>
         </w:pBdr>
@@ -101,13 +101,13 @@
     <w:p>
       <w:pPr>
         <w:widowControl/>
-        <w:spacing w:before="0" w:after="20" w:line="240" w:lineRule="auto"/>
+        <w:spacing w:before="20" w:after="20" w:line="240" w:lineRule="auto"/>
       </w:pPr>
       <w:r>
         <w:rPr>
           <w:rFonts w:ascii="Calibri" w:hAnsi="Calibri" w:eastAsia="Calibri"/>
           <w:b/>
-          <w:sz w:val="19"/>
+          <w:sz w:val="20"/>
         </w:rPr>
         <w:t xml:space="preserve">Languages: </w:t>
       </w:r>
@@ -115,7 +115,7 @@
         <w:rPr>
           <w:rFonts w:ascii="Calibri" w:hAnsi="Calibri" w:eastAsia="Calibri"/>
           <w:b w:val="0"/>
-          <w:sz w:val="19"/>
+          <w:sz w:val="20"/>
         </w:rPr>
         <w:t>JavaScript (ES6+), TypeScript, HTML5, CSS3, SCSS</w:t>
       </w:r>
@@ -123,13 +123,13 @@
     <w:p>
       <w:pPr>
         <w:widowControl/>
-        <w:spacing w:before="0" w:after="20" w:line="240" w:lineRule="auto"/>
+        <w:spacing w:before="20" w:after="20" w:line="240" w:lineRule="auto"/>
       </w:pPr>
       <w:r>
         <w:rPr>
           <w:rFonts w:ascii="Calibri" w:hAnsi="Calibri" w:eastAsia="Calibri"/>
           <w:b/>
-          <w:sz w:val="19"/>
+          <w:sz w:val="20"/>
         </w:rPr>
         <w:t xml:space="preserve">Frontend: </w:t>
       </w:r>
@@ -137,7 +137,7 @@
         <w:rPr>
           <w:rFonts w:ascii="Calibri" w:hAnsi="Calibri" w:eastAsia="Calibri"/>
           <w:b w:val="0"/>
-          <w:sz w:val="19"/>
+          <w:sz w:val="20"/>
         </w:rPr>
         <w:t>React.js, Next.js, Redux, Zustand, React Hook Form, Zod, Tailwind CSS, Responsive Web Design</w:t>
       </w:r>
@@ -145,13 +145,13 @@
     <w:p>
       <w:pPr>
         <w:widowControl/>
-        <w:spacing w:before="0" w:after="20" w:line="240" w:lineRule="auto"/>
+        <w:spacing w:before="20" w:after="20" w:line="240" w:lineRule="auto"/>
       </w:pPr>
       <w:r>
         <w:rPr>
           <w:rFonts w:ascii="Calibri" w:hAnsi="Calibri" w:eastAsia="Calibri"/>
           <w:b/>
-          <w:sz w:val="19"/>
+          <w:sz w:val="20"/>
         </w:rPr>
         <w:t xml:space="preserve">Integration: </w:t>
       </w:r>
@@ -159,7 +159,7 @@
         <w:rPr>
           <w:rFonts w:ascii="Calibri" w:hAnsi="Calibri" w:eastAsia="Calibri"/>
           <w:b w:val="0"/>
-          <w:sz w:val="19"/>
+          <w:sz w:val="20"/>
         </w:rPr>
         <w:t>REST APIs, Payload CMS, PostgreSQL, Azure Functions, Microsoft Graph API, Firebase, Google Maps API</w:t>
       </w:r>
@@ -167,13 +167,13 @@
     <w:p>
       <w:pPr>
         <w:widowControl/>
-        <w:spacing w:before="0" w:after="20" w:line="240" w:lineRule="auto"/>
+        <w:spacing w:before="20" w:after="20" w:line="240" w:lineRule="auto"/>
       </w:pPr>
       <w:r>
         <w:rPr>
           <w:rFonts w:ascii="Calibri" w:hAnsi="Calibri" w:eastAsia="Calibri"/>
           <w:b/>
-          <w:sz w:val="19"/>
+          <w:sz w:val="20"/>
         </w:rPr>
         <w:t xml:space="preserve">Tools: </w:t>
       </w:r>
@@ -181,7 +181,7 @@
         <w:rPr>
           <w:rFonts w:ascii="Calibri" w:hAnsi="Calibri" w:eastAsia="Calibri"/>
           <w:b w:val="0"/>
-          <w:sz w:val="19"/>
+          <w:sz w:val="20"/>
         </w:rPr>
         <w:t>Git, GitHub, Railway, Linux VM, Agile, Code Review, UI/UX implementation</w:t>
       </w:r>
@@ -189,7 +189,7 @@
     <w:p>
       <w:pPr>
         <w:widowControl/>
-        <w:spacing w:before="80" w:after="20" w:line="240" w:lineRule="auto"/>
+        <w:spacing w:before="80" w:after="40" w:line="240" w:lineRule="auto"/>
         <w:pBdr>
           <w:bottom w:val="single" w:sz="8" w:space="1" w:color="1F4E79"/>
         </w:pBdr>
@@ -208,9 +208,9 @@
       <w:pPr>
         <w:widowControl/>
         <w:tabs>
-          <w:tab w:pos="11088" w:val="right"/>
+          <w:tab w:pos="10296" w:val="right"/>
         </w:tabs>
-        <w:spacing w:before="80" w:after="0" w:line="240" w:lineRule="auto"/>
+        <w:spacing w:before="60" w:after="0" w:line="240" w:lineRule="auto"/>
       </w:pPr>
       <w:r>
         <w:rPr>
@@ -234,7 +234,7 @@
       <w:pPr>
         <w:widowControl/>
         <w:tabs>
-          <w:tab w:pos="11088" w:val="right"/>
+          <w:tab w:pos="10296" w:val="right"/>
         </w:tabs>
         <w:spacing w:before="0" w:after="20" w:line="240" w:lineRule="auto"/>
       </w:pPr>
@@ -268,7 +268,7 @@
         <w:rPr>
           <w:rFonts w:ascii="Calibri" w:hAnsi="Calibri" w:eastAsia="Calibri"/>
           <w:b w:val="0"/>
-          <w:sz w:val="18"/>
+          <w:sz w:val="20"/>
         </w:rPr>
         <w:t>- Owned frontend for five production apps in React.js, Next.js, and TypeScript: Prism (solar shop floor), warranty and claims, Board Meeting and Committee (BMC), Roamiyo travel admin, and the Emmvee Foundation website.</w:t>
       </w:r>
@@ -283,7 +283,7 @@
         <w:rPr>
           <w:rFonts w:ascii="Calibri" w:hAnsi="Calibri" w:eastAsia="Calibri"/>
           <w:b w:val="0"/>
-          <w:sz w:val="18"/>
+          <w:sz w:val="20"/>
         </w:rPr>
         <w:t>- Built Prism dashboards with RBAC for QA, Production, PPC, Admin, Super Admin, and Manager, including line and module reports.</w:t>
       </w:r>
@@ -298,9 +298,9 @@
         <w:rPr>
           <w:rFonts w:ascii="Calibri" w:hAnsi="Calibri" w:eastAsia="Calibri"/>
           <w:b w:val="0"/>
-          <w:sz w:val="18"/>
+          <w:sz w:val="20"/>
         </w:rPr>
-        <w:t>- Developed the React.js warranty portal with Zustand authentication for 15+ roles. Covered invoice and PSN transfer, claim intake, QA assignment, refund, replacement, and rework tickets, multi-level approvals, and certificate download.</w:t>
+        <w:t>- Developed the React.js warranty portal with Zustand authentication for 15+ roles (homeowner, distributor, CSR, QA, Finance, Sales, and others). Covered invoice and PSN transfer, claim intake, QA assignment, refund, replacement, and rework tickets, multi-level approvals, and certificate download.</w:t>
       </w:r>
     </w:p>
     <w:p>
@@ -313,7 +313,7 @@
         <w:rPr>
           <w:rFonts w:ascii="Calibri" w:hAnsi="Calibri" w:eastAsia="Calibri"/>
           <w:b w:val="0"/>
-          <w:sz w:val="18"/>
+          <w:sz w:val="20"/>
         </w:rPr>
         <w:t>- Implemented BMC in Next.js, Tailwind CSS, and SCSS for Microsoft Teams-connected meetings: create, approve, cancel, reject, agendas, attendance, action items, AI-generated minutes of meeting (MOM), documents, and user management. Backend used Microsoft Graph API.</w:t>
       </w:r>
@@ -328,7 +328,7 @@
         <w:rPr>
           <w:rFonts w:ascii="Calibri" w:hAnsi="Calibri" w:eastAsia="Calibri"/>
           <w:b w:val="0"/>
-          <w:sz w:val="18"/>
+          <w:sz w:val="20"/>
         </w:rPr>
         <w:t>- Built the Roamiyo admin dashboard in Next.js (customers, flights, stays, transactions, tickets, itineraries, charts) and contributed to the production RoamWithRoamiyo web app using Redux, Azure Functions, and Next.js.</w:t>
       </w:r>
@@ -343,18 +343,33 @@
         <w:rPr>
           <w:rFonts w:ascii="Calibri" w:hAnsi="Calibri" w:eastAsia="Calibri"/>
           <w:b w:val="0"/>
-          <w:sz w:val="18"/>
+          <w:sz w:val="20"/>
         </w:rPr>
-        <w:t>- Delivered the Foundation website with Next.js, Payload CMS, and PostgreSQL. Deployed Foundation and BMC on Railway; deployed Prism and Warranty on a Linux VM. Sole frontend owner on most products; guided 2-3 frontend developers on selected work.</w:t>
+        <w:t>- Delivered the Foundation website with Next.js, Payload CMS, and PostgreSQL, including customized admin CSS. Deployed Foundation and BMC on Railway; deployed Prism and Warranty on a Linux VM.</w:t>
+      </w:r>
+    </w:p>
+    <w:p>
+      <w:pPr>
+        <w:widowControl/>
+        <w:spacing w:before="0" w:after="20" w:line="240" w:lineRule="auto"/>
+        <w:ind w:left="230" w:hanging="187"/>
+      </w:pPr>
+      <w:r>
+        <w:rPr>
+          <w:rFonts w:ascii="Calibri" w:hAnsi="Calibri" w:eastAsia="Calibri"/>
+          <w:b w:val="0"/>
+          <w:sz w:val="20"/>
+        </w:rPr>
+        <w:t>- Acted as sole frontend owner on most products and guided 2-3 frontend developers on selected projects.</w:t>
       </w:r>
     </w:p>
     <w:p>
       <w:pPr>
         <w:widowControl/>
         <w:tabs>
-          <w:tab w:pos="11088" w:val="right"/>
+          <w:tab w:pos="10296" w:val="right"/>
         </w:tabs>
-        <w:spacing w:before="80" w:after="0" w:line="240" w:lineRule="auto"/>
+        <w:spacing w:before="60" w:after="0" w:line="240" w:lineRule="auto"/>
       </w:pPr>
       <w:r>
         <w:rPr>
@@ -378,7 +393,7 @@
       <w:pPr>
         <w:widowControl/>
         <w:tabs>
-          <w:tab w:pos="11088" w:val="right"/>
+          <w:tab w:pos="10296" w:val="right"/>
         </w:tabs>
         <w:spacing w:before="0" w:after="20" w:line="240" w:lineRule="auto"/>
       </w:pPr>
@@ -412,7 +427,7 @@
         <w:rPr>
           <w:rFonts w:ascii="Calibri" w:hAnsi="Calibri" w:eastAsia="Calibri"/>
           <w:b w:val="0"/>
-          <w:sz w:val="18"/>
+          <w:sz w:val="20"/>
         </w:rPr>
         <w:t>- Built a multi-step partner onboarding dashboard with React Hook Form, Zod validation, token-based authentication, Google Maps API, and Firebase event logging.</w:t>
       </w:r>
@@ -427,7 +442,7 @@
         <w:rPr>
           <w:rFonts w:ascii="Calibri" w:hAnsi="Calibri" w:eastAsia="Calibri"/>
           <w:b w:val="0"/>
-          <w:sz w:val="18"/>
+          <w:sz w:val="20"/>
         </w:rPr>
         <w:t>- Developed a Next.js and TypeScript admin dashboard for user and partner management and a blog CMS.</w:t>
       </w:r>
@@ -442,7 +457,7 @@
         <w:rPr>
           <w:rFonts w:ascii="Calibri" w:hAnsi="Calibri" w:eastAsia="Calibri"/>
           <w:b w:val="0"/>
-          <w:sz w:val="18"/>
+          <w:sz w:val="20"/>
         </w:rPr>
         <w:t>- Collaborated with design and backend teams on product features, code reviews, debugging, and maintainable UI.</w:t>
       </w:r>
@@ -451,9 +466,9 @@
       <w:pPr>
         <w:widowControl/>
         <w:tabs>
-          <w:tab w:pos="11088" w:val="right"/>
+          <w:tab w:pos="10296" w:val="right"/>
         </w:tabs>
-        <w:spacing w:before="80" w:after="0" w:line="240" w:lineRule="auto"/>
+        <w:spacing w:before="60" w:after="0" w:line="240" w:lineRule="auto"/>
       </w:pPr>
       <w:r>
         <w:rPr>
@@ -477,7 +492,7 @@
       <w:pPr>
         <w:widowControl/>
         <w:tabs>
-          <w:tab w:pos="11088" w:val="right"/>
+          <w:tab w:pos="10296" w:val="right"/>
         </w:tabs>
         <w:spacing w:before="0" w:after="20" w:line="240" w:lineRule="auto"/>
       </w:pPr>
@@ -511,7 +526,7 @@
         <w:rPr>
           <w:rFonts w:ascii="Calibri" w:hAnsi="Calibri" w:eastAsia="Calibri"/>
           <w:b w:val="0"/>
-          <w:sz w:val="18"/>
+          <w:sz w:val="20"/>
         </w:rPr>
         <w:t>- MOST, line balancing, kaizen, ergonomics, and cost reduction in automotive manufacturing. This domain background supports solar production UIs such as Prism.</w:t>
       </w:r>
@@ -519,7 +534,7 @@
     <w:p>
       <w:pPr>
         <w:widowControl/>
-        <w:spacing w:before="80" w:after="20" w:line="240" w:lineRule="auto"/>
+        <w:spacing w:before="80" w:after="40" w:line="240" w:lineRule="auto"/>
         <w:pBdr>
           <w:bottom w:val="single" w:sz="8" w:space="1" w:color="1F4E79"/>
         </w:pBdr>
@@ -538,9 +553,9 @@
       <w:pPr>
         <w:widowControl/>
         <w:tabs>
-          <w:tab w:pos="11088" w:val="right"/>
+          <w:tab w:pos="10296" w:val="right"/>
         </w:tabs>
-        <w:spacing w:before="80" w:after="0" w:line="240" w:lineRule="auto"/>
+        <w:spacing w:before="60" w:after="0" w:line="240" w:lineRule="auto"/>
       </w:pPr>
       <w:r>
         <w:rPr>
@@ -564,7 +579,7 @@
       <w:pPr>
         <w:widowControl/>
         <w:tabs>
-          <w:tab w:pos="11088" w:val="right"/>
+          <w:tab w:pos="10296" w:val="right"/>
         </w:tabs>
         <w:spacing w:before="0" w:after="20" w:line="240" w:lineRule="auto"/>
       </w:pPr>
@@ -591,7 +606,7 @@
     <w:p>
       <w:pPr>
         <w:widowControl/>
-        <w:spacing w:before="80" w:after="20" w:line="240" w:lineRule="auto"/>
+        <w:spacing w:before="80" w:after="40" w:line="240" w:lineRule="auto"/>
         <w:pBdr>
           <w:bottom w:val="single" w:sz="8" w:space="1" w:color="1F4E79"/>
         </w:pBdr>
@@ -615,14 +630,14 @@
         <w:rPr>
           <w:rFonts w:ascii="Calibri" w:hAnsi="Calibri" w:eastAsia="Calibri"/>
           <w:b w:val="0"/>
-          <w:sz w:val="19"/>
+          <w:sz w:val="20"/>
         </w:rPr>
         <w:t>JavaScript and React.js, NamasteDev; Web Development, Udemy; Core Java, Smart Programming</w:t>
       </w:r>
     </w:p>
     <w:sectPr>
-      <w:pgSz w:w="12240" w:h="15840"/>
-      <w:pgMar w:top="547" w:right="691" w:bottom="461" w:left="691" w:header="720" w:footer="720" w:gutter="0"/>
+      <w:pgSz w:w="11909" w:h="16834"/>
+      <w:pgMar w:top="720" w:right="792" w:bottom="648" w:left="792" w:header="720" w:footer="720" w:gutter="0"/>
       <w:cols w:space="720"/>
       <w:docGrid w:linePitch="360"/>
     </w:sectPr>

</xml_diff>